<commit_message>
Guida chiusura cassa: formato compatto su 2 facciate
5 sezioni (era 7), niente salti pagina, senza frontespizio.
Riepilogo e sessioni archiviate compattati, backup sintetico.

Co-Authored-By: Claude Sonnet 4.6 <noreply@anthropic.com>
</commit_message>
<xml_diff>
--- a/Guida_Rapida_Chiusura_Cassa.docx
+++ b/Guida_Rapida_Chiusura_Cassa.docx
@@ -4,57 +4,7 @@
   <w:body>
     <w:p>
       <w:pPr>
-        <w:spacing w:before="2000"/>
-      </w:pPr>
-    </w:p>
-    <w:p>
-      <w:pPr>
-        <w:spacing w:after="200"/>
-        <w:jc w:val="center"/>
-      </w:pPr>
-      <w:r>
-        <w:rPr>
-          <w:b/>
-          <w:color w:val="1A5276"/>
-          <w:sz w:val="72"/>
-        </w:rPr>
-        <w:t>CASSA DALILA</w:t>
-      </w:r>
-    </w:p>
-    <w:p>
-      <w:pPr>
-        <w:spacing w:after="600"/>
-        <w:jc w:val="center"/>
-      </w:pPr>
-      <w:r>
-        <w:rPr>
-          <w:i/>
-          <w:color w:val="666666"/>
-          <w:sz w:val="36"/>
-        </w:rPr>
-        <w:t>Chiusura cassa</w:t>
-      </w:r>
-    </w:p>
-    <w:p>
-      <w:pPr>
-        <w:pBdr>
-          <w:bottom w:val="single" w:sz="8" w:space="1" w:color="D97706"/>
-        </w:pBdr>
-        <w:spacing w:after="600"/>
-        <w:jc w:val="center"/>
-      </w:pPr>
-      <w:r>
-        <w:rPr>
-          <w:sz w:val="24"/>
-          <w:szCs w:val="24"/>
-        </w:rPr>
-        <w:t xml:space="preserve"> </w:t>
-      </w:r>
-    </w:p>
-    <w:p>
-      <w:pPr>
-        <w:spacing w:before="600" w:after="120"/>
-        <w:jc w:val="center"/>
+        <w:spacing w:before="0" w:after="60"/>
       </w:pPr>
       <w:r>
         <w:rPr>
@@ -62,141 +12,44 @@
           <w:color w:val="1A5276"/>
           <w:sz w:val="36"/>
         </w:rPr>
-        <w:t>GUIDA RAPIDA</w:t>
-      </w:r>
-    </w:p>
-    <w:p>
-      <w:pPr>
-        <w:spacing w:after="2000"/>
-        <w:jc w:val="center"/>
+        <w:t>GUIDA RAPIDA — CHIUSURA CASSA</w:t>
+      </w:r>
+    </w:p>
+    <w:p>
+      <w:pPr>
+        <w:spacing w:before="0" w:after="200"/>
       </w:pPr>
       <w:r>
         <w:rPr>
           <w:color w:val="666666"/>
-          <w:sz w:val="24"/>
+          <w:sz w:val="20"/>
         </w:rPr>
-        <w:t>Procedura di chiusura a fine serata</w:t>
-      </w:r>
-    </w:p>
-    <w:p>
-      <w:pPr>
-        <w:spacing w:after="120"/>
-        <w:jc w:val="center"/>
-      </w:pPr>
-      <w:r>
-        <w:rPr>
-          <w:color w:val="666666"/>
-        </w:rPr>
-        <w:t>v1.4  |  2026</w:t>
-      </w:r>
-    </w:p>
-    <w:p>
-      <w:r>
-        <w:br w:type="page"/>
-      </w:r>
-    </w:p>
-    <w:p>
-      <w:pPr>
-        <w:sectPr>
-          <w:headerReference w:type="default" r:id="rId11"/>
-          <w:footerReference w:type="default" r:id="rId12"/>
-          <w:headerReference w:type="even" r:id="rId13"/>
-          <w:footerReference w:type="even" r:id="rId14"/>
-          <w:headerReference w:type="first" r:id="rId15"/>
-          <w:footerReference w:type="first" r:id="rId16"/>
-          <w:pgSz w:w="11906" w:h="16838"/>
-          <w:pgMar w:top="1440" w:right="1440" w:bottom="1440" w:left="1440" w:header="708" w:footer="708" w:gutter="0"/>
-          <w:cols w:space="720"/>
-          <w:docGrid w:linePitch="360"/>
-        </w:sectPr>
-      </w:pPr>
-    </w:p>
+        <w:t>Cassa Dalila v1.4  ·  Oratorio Dalila</w:t>
+      </w:r>
+    </w:p>
+    <w:sectPr>
+      <w:headerReference w:type="default" r:id="rId7"/>
+      <w:footerReference w:type="default" r:id="rId8"/>
+      <w:pgSz w:w="11906" w:h="16838"/>
+      <w:pgMar w:top="1200" w:right="1200" w:bottom="1200" w:left="1440" w:header="708" w:footer="708" w:gutter="0"/>
+      <w:cols w:space="720"/>
+      <w:docGrid w:linePitch="360"/>
+    </w:sectPr>
     <w:p>
       <w:pPr>
         <w:pStyle w:val="Heading10"/>
-      </w:pPr>
-      <w:r>
-        <w:t>1. Quando chiudere la cassa</w:t>
-      </w:r>
-    </w:p>
-    <w:p>
-      <w:pPr>
-        <w:spacing w:after="120"/>
-      </w:pPr>
-      <w:r>
-        <w:t>La chiusura cassa va eseguita a fine di ogni serata o evento. Archivia tutti gli scontrini della sessione e azzera il contatore (il prossimo scontrino ripartirà da #0001).</w:t>
-      </w:r>
-    </w:p>
-    <w:p>
-      <w:pPr>
-        <w:pStyle w:val="Paragrafoelenco"/>
-        <w:numPr>
-          <w:ilvl w:val="0"/>
-          <w:numId w:val="2"/>
-        </w:numPr>
-        <w:spacing w:before="40" w:after="40"/>
-      </w:pPr>
-      <w:r>
-        <w:t>Eseguila sempre prima di spegnere il sistema a fine serata</w:t>
-      </w:r>
-    </w:p>
-    <w:p>
-      <w:pPr>
-        <w:pStyle w:val="Paragrafoelenco"/>
-        <w:numPr>
-          <w:ilvl w:val="0"/>
-          <w:numId w:val="2"/>
-        </w:numPr>
-        <w:spacing w:before="40" w:after="40"/>
-      </w:pPr>
-      <w:r>
-        <w:t>Solo gli amministratori possono eseguirla</w:t>
-      </w:r>
-    </w:p>
-    <w:p>
-      <w:pPr>
-        <w:pStyle w:val="Paragrafoelenco"/>
-        <w:numPr>
-          <w:ilvl w:val="0"/>
-          <w:numId w:val="2"/>
-        </w:numPr>
-        <w:spacing w:before="40" w:after="40"/>
-      </w:pPr>
-      <w:r>
-        <w:t>È irreversibile: una volta confermata non si può annullare</w:t>
-      </w:r>
-    </w:p>
-    <w:p>
-      <w:pPr>
-        <w:pBdr>
-          <w:left w:val="single" w:sz="12" w:space="8" w:color="D97706"/>
-        </w:pBdr>
-        <w:shd w:val="clear" w:color="auto" w:fill="FEF3C7"/>
-        <w:spacing w:before="100" w:after="100"/>
-        <w:ind w:left="200"/>
-      </w:pPr>
-      <w:r>
-        <w:rPr>
-          <w:b/>
-          <w:color w:val="D97706"/>
-        </w:rPr>
-        <w:t xml:space="preserve">Nota: </w:t>
-      </w:r>
-      <w:r>
-        <w:t>Le sessioni archiviate rimangono consultabili in Statistiche → Sessioni archiviate. I dati non vengono mai cancellati.</w:t>
-      </w:r>
-    </w:p>
-    <w:p>
-      <w:r>
-        <w:br w:type="page"/>
-      </w:r>
-    </w:p>
-    <w:p>
-      <w:pPr>
-        <w:pStyle w:val="Heading10"/>
-      </w:pPr>
-      <w:r>
-        <w:t>2. Procedura di chiusura</w:t>
+        <w:spacing w:before="160" w:after="60"/>
+      </w:pPr>
+      <w:r>
+        <w:t>1. Procedura di chiusura</w:t>
+      </w:r>
+    </w:p>
+    <w:p>
+      <w:pPr>
+        <w:spacing w:after="80"/>
+      </w:pPr>
+      <w:r>
+        <w:t>Solo gli amministratori possono eseguirla. È irreversibile — i dati non vengono cancellati.</w:t>
       </w:r>
     </w:p>
     <w:p>
@@ -206,10 +59,10 @@
           <w:ilvl w:val="0"/>
           <w:numId w:val="3"/>
         </w:numPr>
-        <w:spacing w:before="40" w:after="40"/>
-      </w:pPr>
-      <w:r>
-        <w:t>Vai nella pagina Statistiche</w:t>
+        <w:spacing w:before="20" w:after="20"/>
+      </w:pPr>
+      <w:r>
+        <w:t>Vai in Statistiche → pulsante 🔒 Chiudi cassa</w:t>
       </w:r>
     </w:p>
     <w:p>
@@ -219,10 +72,10 @@
           <w:ilvl w:val="0"/>
           <w:numId w:val="3"/>
         </w:numPr>
-        <w:spacing w:before="40" w:after="40"/>
-      </w:pPr>
-      <w:r>
-        <w:t>Premi il pulsante 🔒 Chiudi cassa (visibile solo agli amministratori)</w:t>
+        <w:spacing w:before="20" w:after="20"/>
+      </w:pPr>
+      <w:r>
+        <w:t>Si apre l'anteprima con il riepilogo della sessione</w:t>
       </w:r>
     </w:p>
     <w:p>
@@ -232,10 +85,10 @@
           <w:ilvl w:val="0"/>
           <w:numId w:val="3"/>
         </w:numPr>
-        <w:spacing w:before="40" w:after="40"/>
-      </w:pPr>
-      <w:r>
-        <w:t>Si apre l'anteprima con il riepilogo della sessione corrente</w:t>
+        <w:spacing w:before="20" w:after="20"/>
+      </w:pPr>
+      <w:r>
+        <w:t>Verifica i totali (vedi sezione 2)</w:t>
       </w:r>
     </w:p>
     <w:p>
@@ -245,10 +98,10 @@
           <w:ilvl w:val="0"/>
           <w:numId w:val="3"/>
         </w:numPr>
-        <w:spacing w:before="40" w:after="40"/>
-      </w:pPr>
-      <w:r>
-        <w:t>Verifica i dati (vedi sezione successiva)</w:t>
+        <w:spacing w:before="20" w:after="20"/>
+      </w:pPr>
+      <w:r>
+        <w:t>Assegna un nome alla sessione (opzionale — di default usa la data)</w:t>
       </w:r>
     </w:p>
     <w:p>
@@ -258,10 +111,10 @@
           <w:ilvl w:val="0"/>
           <w:numId w:val="3"/>
         </w:numPr>
-        <w:spacing w:before="40" w:after="40"/>
-      </w:pPr>
-      <w:r>
-        <w:t>Assegna un nome alla sessione se vuoi (opzionale — di default usa la data)</w:t>
+        <w:spacing w:before="20" w:after="20"/>
+      </w:pPr>
+      <w:r>
+        <w:t>Clicca Chiudi cassa → Conferma</w:t>
       </w:r>
     </w:p>
     <w:p>
@@ -271,49 +124,10 @@
           <w:ilvl w:val="0"/>
           <w:numId w:val="3"/>
         </w:numPr>
-        <w:spacing w:before="40" w:after="40"/>
-      </w:pPr>
-      <w:r>
-        <w:t>Clicca Chiudi cassa →</w:t>
-      </w:r>
-    </w:p>
-    <w:p>
-      <w:pPr>
-        <w:pStyle w:val="Paragrafoelenco"/>
-        <w:numPr>
-          <w:ilvl w:val="0"/>
-          <w:numId w:val="3"/>
-        </w:numPr>
-        <w:spacing w:before="40" w:after="40"/>
-      </w:pPr>
-      <w:r>
-        <w:t>Conferma nella schermata di avviso</w:t>
-      </w:r>
-    </w:p>
-    <w:p>
-      <w:pPr>
-        <w:pStyle w:val="Paragrafoelenco"/>
-        <w:numPr>
-          <w:ilvl w:val="0"/>
-          <w:numId w:val="3"/>
-        </w:numPr>
-        <w:spacing w:before="40" w:after="40"/>
-      </w:pPr>
-      <w:r>
-        <w:t>Attendi il completamento dell'archiviazione</w:t>
-      </w:r>
-    </w:p>
-    <w:p>
-      <w:pPr>
-        <w:pStyle w:val="Paragrafoelenco"/>
-        <w:numPr>
-          <w:ilvl w:val="0"/>
-          <w:numId w:val="3"/>
-        </w:numPr>
-        <w:spacing w:before="40" w:after="40"/>
-      </w:pPr>
-      <w:r>
-        <w:t>Al termine il sistema mostra il riepilogo finale</w:t>
+        <w:spacing w:before="20" w:after="20"/>
+      </w:pPr>
+      <w:r>
+        <w:t>Attendi il completamento; al termine appare il riepilogo finale</w:t>
       </w:r>
     </w:p>
     <w:p>
@@ -333,28 +147,16 @@
         <w:t xml:space="preserve">Attenzione: </w:t>
       </w:r>
       <w:r>
-        <w:t>Assicurati che non ci siano scontrini in corso di compilazione su altri dispositivi prima di chiudere.</w:t>
-      </w:r>
-    </w:p>
-    <w:p>
-      <w:r>
-        <w:br w:type="page"/>
+        <w:t>Prima di chiudere assicurati che nessun altro dispositivo abbia scontrini in corso.</w:t>
       </w:r>
     </w:p>
     <w:p>
       <w:pPr>
         <w:pStyle w:val="Heading10"/>
-      </w:pPr>
-      <w:r>
-        <w:t>3. Interpretare il riepilogo</w:t>
-      </w:r>
-    </w:p>
-    <w:p>
-      <w:pPr>
-        <w:spacing w:after="120"/>
-      </w:pPr>
-      <w:r>
-        <w:t>L'anteprima mostra un riepilogo completo della sessione:</w:t>
+        <w:spacing w:before="160" w:after="60"/>
+      </w:pPr>
+      <w:r>
+        <w:t>2. Cosa verificare nel riepilogo</w:t>
       </w:r>
     </w:p>
     <w:tbl>
@@ -434,7 +236,7 @@
               <w:rPr>
                 <w:b/>
               </w:rPr>
-              <w:t>Significato</w:t>
+              <w:t>Cosa fare</w:t>
             </w:r>
           </w:p>
         </w:tc>
@@ -446,7 +248,7 @@
           </w:tcPr>
           <w:p>
             <w:r>
-              <w:t>Scontrini validi</w:t>
+              <w:t>Incasso reale (Contanti + Carta + Satispay)</w:t>
             </w:r>
           </w:p>
         </w:tc>
@@ -456,95 +258,7 @@
           </w:tcPr>
           <w:p>
             <w:r>
-              <w:t>Numero di scontrini emessi e non stornati</w:t>
-            </w:r>
-          </w:p>
-        </w:tc>
-      </w:tr>
-      <w:tr>
-        <w:tc>
-          <w:tcPr>
-            <w:tcW w:type="dxa" w:w="3500"/>
-          </w:tcPr>
-          <w:p>
-            <w:r>
-              <w:t>Incasso reale</w:t>
-            </w:r>
-          </w:p>
-        </w:tc>
-        <w:tc>
-          <w:tcPr>
-            <w:tcW w:type="dxa" w:w="5860"/>
-          </w:tcPr>
-          <w:p>
-            <w:r>
-              <w:t>Soldi fisicamente in cassa: Contanti + Carta + Satispay</w:t>
-            </w:r>
-          </w:p>
-        </w:tc>
-      </w:tr>
-      <w:tr>
-        <w:tc>
-          <w:tcPr>
-            <w:tcW w:type="dxa" w:w="3500"/>
-          </w:tcPr>
-          <w:p>
-            <w:r>
-              <w:t>Contanti</w:t>
-            </w:r>
-          </w:p>
-        </w:tc>
-        <w:tc>
-          <w:tcPr>
-            <w:tcW w:type="dxa" w:w="5860"/>
-          </w:tcPr>
-          <w:p>
-            <w:r>
-              <w:t>Totale incassato in contanti (da verificare col cassetto)</w:t>
-            </w:r>
-          </w:p>
-        </w:tc>
-      </w:tr>
-      <w:tr>
-        <w:tc>
-          <w:tcPr>
-            <w:tcW w:type="dxa" w:w="3500"/>
-          </w:tcPr>
-          <w:p>
-            <w:r>
-              <w:t>Carta</w:t>
-            </w:r>
-          </w:p>
-        </w:tc>
-        <w:tc>
-          <w:tcPr>
-            <w:tcW w:type="dxa" w:w="5860"/>
-          </w:tcPr>
-          <w:p>
-            <w:r>
-              <w:t>Totale pagato con carta (da verificare col POS)</w:t>
-            </w:r>
-          </w:p>
-        </w:tc>
-      </w:tr>
-      <w:tr>
-        <w:tc>
-          <w:tcPr>
-            <w:tcW w:type="dxa" w:w="3500"/>
-          </w:tcPr>
-          <w:p>
-            <w:r>
-              <w:t>Satispay</w:t>
-            </w:r>
-          </w:p>
-        </w:tc>
-        <w:tc>
-          <w:tcPr>
-            <w:tcW w:type="dxa" w:w="5860"/>
-          </w:tcPr>
-          <w:p>
-            <w:r>
-              <w:t>Totale pagato con Satispay</w:t>
+              <w:t>Confronta contanti col cassetto, carta col giornaliero POS</w:t>
             </w:r>
           </w:p>
         </w:tc>
@@ -566,7 +280,7 @@
           </w:tcPr>
           <w:p>
             <w:r>
-              <w:t>Valore dei buoni usati — NON sono soldi in cassa</w:t>
+              <w:t>Valore consumato dai volontari — non è denaro in cassa</w:t>
             </w:r>
           </w:p>
         </w:tc>
@@ -588,7 +302,7 @@
           </w:tcPr>
           <w:p>
             <w:r>
-              <w:t>Valore degli articoli dati in omaggio</w:t>
+              <w:t>Valore articoli dati gratis</w:t>
             </w:r>
           </w:p>
         </w:tc>
@@ -600,7 +314,7 @@
           </w:tcPr>
           <w:p>
             <w:r>
-              <w:t>Stornati</w:t>
+              <w:t>Scontrini stornati</w:t>
             </w:r>
           </w:p>
         </w:tc>
@@ -610,7 +324,7 @@
           </w:tcPr>
           <w:p>
             <w:r>
-              <w:t>Numero di scontrini annullati (mostrato in rosso)</w:t>
+              <w:t>Verificare se inattesi (mostrati in rosso)</w:t>
             </w:r>
           </w:p>
         </w:tc>
@@ -633,226 +347,24 @@
         <w:t xml:space="preserve">Suggerimento: </w:t>
       </w:r>
       <w:r>
-        <w:t>Prima di confermare, confronta il totale Contanti con il denaro nel cassetto e il totale Carta con il giornaliero del POS.</w:t>
-      </w:r>
-    </w:p>
-    <w:p>
-      <w:r>
-        <w:br w:type="page"/>
+        <w:t>Se i totali non tornano, controlla lo Storico prima di confermare.</w:t>
       </w:r>
     </w:p>
     <w:p>
       <w:pPr>
         <w:pStyle w:val="Heading10"/>
-      </w:pPr>
-      <w:r>
-        <w:t>4. Il report via email</w:t>
-      </w:r>
-    </w:p>
-    <w:p>
-      <w:pPr>
-        <w:spacing w:after="120"/>
-      </w:pPr>
-      <w:r>
-        <w:t>Se i destinatari sono configurati in Setup → Notifiche, alla chiusura viene inviata automaticamente un'email con allegato Excel.</w:t>
-      </w:r>
-    </w:p>
-    <w:tbl>
-      <w:tblPr>
-        <w:tblW w:w="9360" w:type="dxa"/>
-        <w:tblInd w:w="130" w:type="dxa"/>
-        <w:tblBorders>
-          <w:top w:val="single" w:sz="4" w:space="0" w:color="auto"/>
-          <w:left w:val="single" w:sz="4" w:space="0" w:color="auto"/>
-          <w:bottom w:val="single" w:sz="4" w:space="0" w:color="auto"/>
-          <w:right w:val="single" w:sz="4" w:space="0" w:color="auto"/>
-          <w:insideH w:val="single" w:sz="4" w:space="0" w:color="auto"/>
-          <w:insideV w:val="single" w:sz="4" w:space="0" w:color="auto"/>
-        </w:tblBorders>
-        <w:tblCellMar>
-          <w:left w:w="10" w:type="dxa"/>
-          <w:right w:w="10" w:type="dxa"/>
-        </w:tblCellMar>
-        <w:tblLook w:val="04A0"/>
-      </w:tblPr>
-      <w:tblGrid>
-        <w:gridCol w:w="3500"/>
-        <w:gridCol w:w="5860"/>
-      </w:tblGrid>
-      <w:tr>
-        <w:tblPrEx>
-          <w:tblCellMar>
-            <w:top w:w="0" w:type="dxa"/>
-            <w:bottom w:w="0" w:type="dxa"/>
-          </w:tblCellMar>
-        </w:tblPrEx>
-        <w:tc>
-          <w:tcPr>
-            <w:tcW w:w="3500" w:type="dxa"/>
-            <w:tcBorders>
-              <w:top w:val="single" w:sz="1" w:space="0" w:color="CCCCCC"/>
-              <w:left w:val="single" w:sz="1" w:space="0" w:color="CCCCCC"/>
-              <w:bottom w:val="single" w:sz="1" w:space="0" w:color="CCCCCC"/>
-              <w:right w:val="single" w:sz="1" w:space="0" w:color="CCCCCC"/>
-            </w:tcBorders>
-            <w:shd w:val="clear" w:color="auto" w:fill="F5F5F5"/>
-            <w:tcMar>
-              <w:top w:w="80" w:type="dxa"/>
-              <w:left w:w="140" w:type="dxa"/>
-              <w:bottom w:w="80" w:type="dxa"/>
-              <w:right w:w="140" w:type="dxa"/>
-            </w:tcMar>
-          </w:tcPr>
-          <w:p>
-            <w:r>
-              <w:rPr>
-                <w:b/>
-              </w:rPr>
-              <w:t>Foglio XLS</w:t>
-            </w:r>
-          </w:p>
-        </w:tc>
-        <w:tc>
-          <w:tcPr>
-            <w:tcW w:w="5860" w:type="dxa"/>
-            <w:tcBorders>
-              <w:top w:val="single" w:sz="1" w:space="0" w:color="CCCCCC"/>
-              <w:left w:val="single" w:sz="1" w:space="0" w:color="CCCCCC"/>
-              <w:bottom w:val="single" w:sz="1" w:space="0" w:color="CCCCCC"/>
-              <w:right w:val="single" w:sz="1" w:space="0" w:color="CCCCCC"/>
-            </w:tcBorders>
-            <w:shd w:val="clear" w:color="auto" w:fill="F5F5F5"/>
-            <w:tcMar>
-              <w:top w:w="80" w:type="dxa"/>
-              <w:left w:w="140" w:type="dxa"/>
-              <w:bottom w:w="80" w:type="dxa"/>
-              <w:right w:w="140" w:type="dxa"/>
-            </w:tcMar>
-          </w:tcPr>
-          <w:p>
-            <w:r>
-              <w:rPr>
-                <w:b/>
-              </w:rPr>
-              <w:t>Contenuto</w:t>
-            </w:r>
-          </w:p>
-        </w:tc>
-      </w:tr>
-      <w:tr>
-        <w:tc>
-          <w:tcPr>
-            <w:tcW w:type="dxa" w:w="3500"/>
-          </w:tcPr>
-          <w:p>
-            <w:r>
-              <w:t>Riepilogo</w:t>
-            </w:r>
-          </w:p>
-        </w:tc>
-        <w:tc>
-          <w:tcPr>
-            <w:tcW w:type="dxa" w:w="5860"/>
-          </w:tcPr>
-          <w:p>
-            <w:r>
-              <w:t>Totali: incasso reale, buoni, scontrini, media, per metodo di pagamento</w:t>
-            </w:r>
-          </w:p>
-        </w:tc>
-      </w:tr>
-      <w:tr>
-        <w:tc>
-          <w:tcPr>
-            <w:tcW w:type="dxa" w:w="3500"/>
-          </w:tcPr>
-          <w:p>
-            <w:r>
-              <w:t>Venduto</w:t>
-            </w:r>
-          </w:p>
-        </w:tc>
-        <w:tc>
-          <w:tcPr>
-            <w:tcW w:type="dxa" w:w="5860"/>
-          </w:tcPr>
-          <w:p>
-            <w:r>
-              <w:t>Quantità e valore per ogni prodotto, con omaggi separati</w:t>
-            </w:r>
-          </w:p>
-        </w:tc>
-      </w:tr>
-      <w:tr>
-        <w:tc>
-          <w:tcPr>
-            <w:tcW w:type="dxa" w:w="3500"/>
-          </w:tcPr>
-          <w:p>
-            <w:r>
-              <w:t>Scontrini</w:t>
-            </w:r>
-          </w:p>
-        </w:tc>
-        <w:tc>
-          <w:tcPr>
-            <w:tcW w:type="dxa" w:w="5860"/>
-          </w:tcPr>
-          <w:p>
-            <w:r>
-              <w:t>Elenco completo di tutti gli scontrini della sessione</w:t>
-            </w:r>
-          </w:p>
-        </w:tc>
-      </w:tr>
-    </w:tbl>
-    <w:p>
-      <w:pPr>
-        <w:spacing w:after="120"/>
-      </w:pPr>
-      <w:r>
-        <w:t>I file vengono salvati anche localmente nella cartella chiusure\ con nome e data della sessione.</w:t>
-      </w:r>
-    </w:p>
-    <w:p>
-      <w:pPr>
-        <w:pBdr>
-          <w:left w:val="single" w:sz="12" w:space="8" w:color="16A34A"/>
-        </w:pBdr>
-        <w:shd w:val="clear" w:color="auto" w:fill="F0FDF4"/>
-        <w:spacing w:before="100" w:after="100"/>
-        <w:ind w:left="200"/>
-      </w:pPr>
-      <w:r>
-        <w:rPr>
-          <w:b/>
-          <w:color w:val="16A34A"/>
-        </w:rPr>
-        <w:t xml:space="preserve">Suggerimento: </w:t>
-      </w:r>
-      <w:r>
-        <w:t>Archivia i file XLS periodicamente su un disco esterno o Drive per avere uno storico completo delle serate.</w:t>
-      </w:r>
-    </w:p>
-    <w:p>
-      <w:r>
-        <w:br w:type="page"/>
-      </w:r>
-    </w:p>
-    <w:p>
-      <w:pPr>
-        <w:pStyle w:val="Heading10"/>
-      </w:pPr>
-      <w:r>
-        <w:t>5. Dopo la chiusura</w:t>
-      </w:r>
-    </w:p>
-    <w:p>
-      <w:pPr>
-        <w:spacing w:after="120"/>
-      </w:pPr>
-      <w:r>
-        <w:t>Dopo la chiusura la cassa è pronta per la sessione successiva:</w:t>
+        <w:spacing w:before="160" w:after="60"/>
+      </w:pPr>
+      <w:r>
+        <w:t>3. Report XLS via email</w:t>
+      </w:r>
+    </w:p>
+    <w:p>
+      <w:pPr>
+        <w:spacing w:after="80"/>
+      </w:pPr>
+      <w:r>
+        <w:t>Se configurata in Setup → Notifiche, l'email arriva automaticamente con allegato Excel (3 fogli):</w:t>
       </w:r>
     </w:p>
     <w:p>
@@ -862,10 +374,10 @@
           <w:ilvl w:val="0"/>
           <w:numId w:val="2"/>
         </w:numPr>
-        <w:spacing w:before="40" w:after="40"/>
-      </w:pPr>
-      <w:r>
-        <w:t>Il contatore scontrini riparte da #0001</w:t>
+        <w:spacing w:before="20" w:after="20"/>
+      </w:pPr>
+      <w:r>
+        <w:t>Riepilogo — incasso reale, buoni, scontrini, media, per metodo di pagamento</w:t>
       </w:r>
     </w:p>
     <w:p>
@@ -875,10 +387,10 @@
           <w:ilvl w:val="0"/>
           <w:numId w:val="2"/>
         </w:numPr>
-        <w:spacing w:before="40" w:after="40"/>
-      </w:pPr>
-      <w:r>
-        <w:t>I saldi dei buoni volontari si azzerano (ogni volontario riparte con il buono pieno)</w:t>
+        <w:spacing w:before="20" w:after="20"/>
+      </w:pPr>
+      <w:r>
+        <w:t>Venduto — quantità e valore per ogni prodotto, omaggi separati</w:t>
       </w:r>
     </w:p>
     <w:p>
@@ -888,10 +400,27 @@
           <w:ilvl w:val="0"/>
           <w:numId w:val="2"/>
         </w:numPr>
-        <w:spacing w:before="40" w:after="40"/>
-      </w:pPr>
-      <w:r>
-        <w:t>Le statistiche "Corrente" mostrano zero (sessione vuota)</w:t>
+        <w:spacing w:before="20" w:after="20"/>
+      </w:pPr>
+      <w:r>
+        <w:t>Scontrini — elenco completo della sessione</w:t>
+      </w:r>
+    </w:p>
+    <w:p>
+      <w:pPr>
+        <w:spacing w:after="80"/>
+      </w:pPr>
+      <w:r>
+        <w:t>I file vengono salvati anche localmente nella cartella chiusure\.</w:t>
+      </w:r>
+    </w:p>
+    <w:p>
+      <w:pPr>
+        <w:pStyle w:val="Heading10"/>
+        <w:spacing w:before="160" w:after="60"/>
+      </w:pPr>
+      <w:r>
+        <w:t>4. Dopo la chiusura</w:t>
       </w:r>
     </w:p>
     <w:p>
@@ -901,23 +430,58 @@
           <w:ilvl w:val="0"/>
           <w:numId w:val="2"/>
         </w:numPr>
-        <w:spacing w:before="40" w:after="40"/>
-      </w:pPr>
-      <w:r>
-        <w:t>Gli scontrini della sessione chiusa sono consultabili in Statistiche → Sessioni archiviate</w:t>
-      </w:r>
-    </w:p>
-    <w:p>
-      <w:r>
-        <w:br w:type="page"/>
+        <w:spacing w:before="20" w:after="20"/>
+      </w:pPr>
+      <w:r>
+        <w:t>Contatore scontrini azzera e riparte da #0001</w:t>
+      </w:r>
+    </w:p>
+    <w:p>
+      <w:pPr>
+        <w:pStyle w:val="Paragrafoelenco"/>
+        <w:numPr>
+          <w:ilvl w:val="0"/>
+          <w:numId w:val="2"/>
+        </w:numPr>
+        <w:spacing w:before="20" w:after="20"/>
+      </w:pPr>
+      <w:r>
+        <w:t>Saldi buoni volontari azzerati — ogni volontario riparte con il buono pieno</w:t>
+      </w:r>
+    </w:p>
+    <w:p>
+      <w:pPr>
+        <w:pStyle w:val="Paragrafoelenco"/>
+        <w:numPr>
+          <w:ilvl w:val="0"/>
+          <w:numId w:val="2"/>
+        </w:numPr>
+        <w:spacing w:before="20" w:after="20"/>
+      </w:pPr>
+      <w:r>
+        <w:t>Statistiche "Corrente" mostrano zero</w:t>
+      </w:r>
+    </w:p>
+    <w:p>
+      <w:pPr>
+        <w:pStyle w:val="Paragrafoelenco"/>
+        <w:numPr>
+          <w:ilvl w:val="0"/>
+          <w:numId w:val="2"/>
+        </w:numPr>
+        <w:spacing w:before="20" w:after="20"/>
+      </w:pPr>
+      <w:r>
+        <w:t>Sessione chiusa consultabile in Statistiche → Sessioni archiviate → seleziona dal menu</w:t>
       </w:r>
     </w:p>
     <w:p>
       <w:pPr>
         <w:pStyle w:val="Heading10"/>
-      </w:pPr>
-      <w:r>
-        <w:t>6. Consultare sessioni passate</w:t>
+        <w:spacing w:before="160" w:after="60"/>
+      </w:pPr>
+      <w:r>
+        <w:t>5. Backup</w:t>
       </w:r>
     </w:p>
     <w:p>
@@ -927,10 +491,10 @@
           <w:ilvl w:val="0"/>
           <w:numId w:val="3"/>
         </w:numPr>
-        <w:spacing w:before="40" w:after="40"/>
-      </w:pPr>
-      <w:r>
-        <w:t>Vai in Statistiche</w:t>
+        <w:spacing w:before="20" w:after="20"/>
+      </w:pPr>
+      <w:r>
+        <w:t>Chiudi il browser</w:t>
       </w:r>
     </w:p>
     <w:p>
@@ -940,10 +504,10 @@
           <w:ilvl w:val="0"/>
           <w:numId w:val="3"/>
         </w:numPr>
-        <w:spacing w:before="40" w:after="40"/>
-      </w:pPr>
-      <w:r>
-        <w:t>Seleziona la scheda Sessioni archiviate</w:t>
+        <w:spacing w:before="20" w:after="20"/>
+      </w:pPr>
+      <w:r>
+        <w:t>Doppio clic su BACKUP_DATI.bat nella cartella del programma</w:t>
       </w:r>
     </w:p>
     <w:p>
@@ -953,109 +517,10 @@
           <w:ilvl w:val="0"/>
           <w:numId w:val="3"/>
         </w:numPr>
-        <w:spacing w:before="40" w:after="40"/>
-      </w:pPr>
-      <w:r>
-        <w:t>Scegli la sessione dal menu a tendina</w:t>
-      </w:r>
-    </w:p>
-    <w:p>
-      <w:pPr>
-        <w:pStyle w:val="Paragrafoelenco"/>
-        <w:numPr>
-          <w:ilvl w:val="0"/>
-          <w:numId w:val="3"/>
-        </w:numPr>
-        <w:spacing w:before="40" w:after="40"/>
-      </w:pPr>
-      <w:r>
-        <w:t>Vengono mostrati tutti i dati della sessione: scontrini, incassi, dettaglio prodotti</w:t>
-      </w:r>
-    </w:p>
-    <w:p>
-      <w:pPr>
-        <w:pStyle w:val="Paragrafoelenco"/>
-        <w:numPr>
-          <w:ilvl w:val="0"/>
-          <w:numId w:val="3"/>
-        </w:numPr>
-        <w:spacing w:before="40" w:after="40"/>
-      </w:pPr>
-      <w:r>
-        <w:t>Puoi esportare in Excel anche le sessioni archiviate</w:t>
-      </w:r>
-    </w:p>
-    <w:p>
-      <w:r>
-        <w:br w:type="page"/>
-      </w:r>
-    </w:p>
-    <w:p>
-      <w:pPr>
-        <w:pStyle w:val="Heading10"/>
-      </w:pPr>
-      <w:r>
-        <w:t>7. Backup dopo la chiusura</w:t>
-      </w:r>
-    </w:p>
-    <w:p>
-      <w:pPr>
-        <w:spacing w:after="120"/>
-      </w:pPr>
-      <w:r>
-        <w:t>Si raccomanda di eseguire un backup dopo ogni chiusura cassa.</w:t>
-      </w:r>
-    </w:p>
-    <w:p>
-      <w:pPr>
-        <w:pStyle w:val="Paragrafoelenco"/>
-        <w:numPr>
-          <w:ilvl w:val="0"/>
-          <w:numId w:val="3"/>
-        </w:numPr>
-        <w:spacing w:before="40" w:after="40"/>
-      </w:pPr>
-      <w:r>
-        <w:t>Chiudi la pagina della cassa nel browser</w:t>
-      </w:r>
-    </w:p>
-    <w:p>
-      <w:pPr>
-        <w:pStyle w:val="Paragrafoelenco"/>
-        <w:numPr>
-          <w:ilvl w:val="0"/>
-          <w:numId w:val="3"/>
-        </w:numPr>
-        <w:spacing w:before="40" w:after="40"/>
-      </w:pPr>
-      <w:r>
-        <w:t>Fai doppio clic su BACKUP_DATI.bat nella cartella del programma</w:t>
-      </w:r>
-    </w:p>
-    <w:p>
-      <w:pPr>
-        <w:pStyle w:val="Paragrafoelenco"/>
-        <w:numPr>
-          <w:ilvl w:val="0"/>
-          <w:numId w:val="3"/>
-        </w:numPr>
-        <w:spacing w:before="40" w:after="40"/>
-      </w:pPr>
-      <w:r>
-        <w:t>Il backup viene salvato in backup\ con data e ora nel nome del file</w:t>
-      </w:r>
-    </w:p>
-    <w:p>
-      <w:pPr>
-        <w:pStyle w:val="Paragrafoelenco"/>
-        <w:numPr>
-          <w:ilvl w:val="0"/>
-          <w:numId w:val="3"/>
-        </w:numPr>
-        <w:spacing w:before="40" w:after="40"/>
-      </w:pPr>
-      <w:r>
-        <w:t>Copia periodicamente la cartella backup\ su un disco esterno</w:t>
+        <w:spacing w:before="20" w:after="20"/>
+      </w:pPr>
+      <w:r>
+        <w:t>Il file viene salvato in backup\ con data e ora nel nome</w:t>
       </w:r>
     </w:p>
     <w:p>
@@ -1075,7 +540,7 @@
         <w:t xml:space="preserve">Attenzione: </w:t>
       </w:r>
       <w:r>
-        <w:t>Non cancellare mai la cartella app\pb_data\. Contiene il database con tutti i dati.</w:t>
+        <w:t>Non cancellare mai la cartella app\pb_data\ — contiene tutto il database.</w:t>
       </w:r>
     </w:p>
   </w:body>

</xml_diff>